<commit_message>
week 6 GIT completed
</commit_message>
<xml_diff>
--- a/Week6/Week 6 output.docx
+++ b/Week6/Week 6 output.docx
@@ -17,6 +17,23 @@
           <w:lang w:val="en-US"/>
         </w:rPr>
         <w:t>WEEK 6 OUTPUT</w:t>
+      </w:r>
+    </w:p>
+    <w:p>
+      <w:pPr>
+        <w:rPr>
+          <w:b/>
+          <w:sz w:val="36"/>
+          <w:lang w:val="en-US"/>
+        </w:rPr>
+      </w:pPr>
+      <w:r>
+        <w:rPr>
+          <w:b/>
+          <w:sz w:val="36"/>
+          <w:lang w:val="en-US"/>
+        </w:rPr>
+        <w:t>REACT</w:t>
       </w:r>
     </w:p>
     <w:p>
@@ -206,6 +223,7 @@
           <w:sz w:val="36"/>
           <w:lang w:eastAsia="en-IN"/>
         </w:rPr>
+        <w:lastRenderedPageBreak/>
         <w:drawing>
           <wp:inline distT="0" distB="0" distL="0" distR="0" wp14:anchorId="180552EF" wp14:editId="1F4B5C17">
             <wp:extent cx="2733261" cy="838200"/>
@@ -257,7 +275,6 @@
           <w:sz w:val="36"/>
           <w:lang w:val="en-US"/>
         </w:rPr>
-        <w:lastRenderedPageBreak/>
         <w:t>Output</w:t>
       </w:r>
     </w:p>
@@ -422,6 +439,7 @@
           <w:sz w:val="36"/>
           <w:lang w:eastAsia="en-IN"/>
         </w:rPr>
+        <w:lastRenderedPageBreak/>
         <w:drawing>
           <wp:inline distT="0" distB="0" distL="0" distR="0" wp14:anchorId="693886A0" wp14:editId="31F3271D">
             <wp:extent cx="5070976" cy="2110740"/>
@@ -482,7 +500,6 @@
           <w:sz w:val="36"/>
           <w:lang w:val="en-US"/>
         </w:rPr>
-        <w:lastRenderedPageBreak/>
         <w:t>HOL</w:t>
       </w:r>
       <w:r>
@@ -593,6 +610,7 @@
           <w:sz w:val="36"/>
           <w:lang w:val="en-US"/>
         </w:rPr>
+        <w:lastRenderedPageBreak/>
         <w:drawing>
           <wp:inline distT="0" distB="0" distL="0" distR="0" wp14:anchorId="6473D0BD" wp14:editId="26885BC0">
             <wp:extent cx="5731510" cy="2922703"/>
@@ -671,7 +689,6 @@
           <w:sz w:val="36"/>
           <w:lang w:val="en-US"/>
         </w:rPr>
-        <w:lastRenderedPageBreak/>
         <w:t>HOL</w:t>
       </w:r>
       <w:r>
@@ -765,6 +782,7 @@
           <w:sz w:val="36"/>
           <w:lang w:val="en-US"/>
         </w:rPr>
+        <w:lastRenderedPageBreak/>
         <w:drawing>
           <wp:inline distT="0" distB="0" distL="0" distR="0" wp14:anchorId="70396065" wp14:editId="38887226">
             <wp:extent cx="5731510" cy="1839472"/>
@@ -894,7 +912,6 @@
           <w:sz w:val="36"/>
           <w:lang w:val="en-US"/>
         </w:rPr>
-        <w:lastRenderedPageBreak/>
         <w:t>HOL13</w:t>
       </w:r>
     </w:p>
@@ -963,6 +980,7 @@
           <w:sz w:val="36"/>
           <w:lang w:val="en-US"/>
         </w:rPr>
+        <w:lastRenderedPageBreak/>
         <w:t>Output</w:t>
       </w:r>
     </w:p>
@@ -1016,8 +1034,814 @@
           </wp:inline>
         </w:drawing>
       </w:r>
+    </w:p>
+    <w:p>
+      <w:pPr>
+        <w:rPr>
+          <w:b/>
+          <w:sz w:val="36"/>
+          <w:lang w:val="en-US"/>
+        </w:rPr>
+      </w:pPr>
+      <w:r>
+        <w:rPr>
+          <w:b/>
+          <w:sz w:val="36"/>
+          <w:lang w:val="en-US"/>
+        </w:rPr>
+        <w:t>GIT</w:t>
+      </w:r>
+      <w:r>
+        <w:rPr>
+          <w:b/>
+          <w:sz w:val="36"/>
+          <w:lang w:val="en-US"/>
+        </w:rPr>
+        <w:br/>
+        <w:t>HOL1</w:t>
+      </w:r>
+    </w:p>
+    <w:p>
+      <w:pPr>
+        <w:rPr>
+          <w:b/>
+          <w:sz w:val="36"/>
+          <w:lang w:val="en-US"/>
+        </w:rPr>
+      </w:pPr>
+      <w:r>
+        <w:rPr>
+          <w:b/>
+          <w:sz w:val="36"/>
+          <w:lang w:val="en-US"/>
+        </w:rPr>
+        <w:drawing>
+          <wp:inline distT="0" distB="0" distL="0" distR="0" wp14:anchorId="4ED41546" wp14:editId="28A7CB83">
+            <wp:extent cx="5731510" cy="3023127"/>
+            <wp:effectExtent l="0" t="0" r="2540" b="6350"/>
+            <wp:docPr id="14" name="Picture 14"/>
+            <wp:cNvGraphicFramePr>
+              <a:graphicFrameLocks xmlns:a="http://schemas.openxmlformats.org/drawingml/2006/main" noChangeAspect="1"/>
+            </wp:cNvGraphicFramePr>
+            <a:graphic xmlns:a="http://schemas.openxmlformats.org/drawingml/2006/main">
+              <a:graphicData uri="http://schemas.openxmlformats.org/drawingml/2006/picture">
+                <pic:pic xmlns:pic="http://schemas.openxmlformats.org/drawingml/2006/picture">
+                  <pic:nvPicPr>
+                    <pic:cNvPr id="0" name=""/>
+                    <pic:cNvPicPr/>
+                  </pic:nvPicPr>
+                  <pic:blipFill>
+                    <a:blip r:embed="rId18"/>
+                    <a:stretch>
+                      <a:fillRect/>
+                    </a:stretch>
+                  </pic:blipFill>
+                  <pic:spPr>
+                    <a:xfrm>
+                      <a:off x="0" y="0"/>
+                      <a:ext cx="5731510" cy="3023127"/>
+                    </a:xfrm>
+                    <a:prstGeom prst="rect">
+                      <a:avLst/>
+                    </a:prstGeom>
+                  </pic:spPr>
+                </pic:pic>
+              </a:graphicData>
+            </a:graphic>
+          </wp:inline>
+        </w:drawing>
+      </w:r>
+    </w:p>
+    <w:p>
+      <w:pPr>
+        <w:rPr>
+          <w:b/>
+          <w:sz w:val="36"/>
+          <w:lang w:val="en-US"/>
+        </w:rPr>
+      </w:pPr>
+      <w:r>
+        <w:rPr>
+          <w:b/>
+          <w:sz w:val="36"/>
+          <w:lang w:val="en-US"/>
+        </w:rPr>
+        <w:lastRenderedPageBreak/>
+        <w:drawing>
+          <wp:inline distT="0" distB="0" distL="0" distR="0" wp14:anchorId="704EBB7D" wp14:editId="7BC66357">
+            <wp:extent cx="5101659" cy="2720340"/>
+            <wp:effectExtent l="0" t="0" r="3810" b="3810"/>
+            <wp:docPr id="15" name="Picture 15"/>
+            <wp:cNvGraphicFramePr>
+              <a:graphicFrameLocks xmlns:a="http://schemas.openxmlformats.org/drawingml/2006/main" noChangeAspect="1"/>
+            </wp:cNvGraphicFramePr>
+            <a:graphic xmlns:a="http://schemas.openxmlformats.org/drawingml/2006/main">
+              <a:graphicData uri="http://schemas.openxmlformats.org/drawingml/2006/picture">
+                <pic:pic xmlns:pic="http://schemas.openxmlformats.org/drawingml/2006/picture">
+                  <pic:nvPicPr>
+                    <pic:cNvPr id="0" name=""/>
+                    <pic:cNvPicPr/>
+                  </pic:nvPicPr>
+                  <pic:blipFill>
+                    <a:blip r:embed="rId19"/>
+                    <a:stretch>
+                      <a:fillRect/>
+                    </a:stretch>
+                  </pic:blipFill>
+                  <pic:spPr>
+                    <a:xfrm>
+                      <a:off x="0" y="0"/>
+                      <a:ext cx="5102616" cy="2720850"/>
+                    </a:xfrm>
+                    <a:prstGeom prst="rect">
+                      <a:avLst/>
+                    </a:prstGeom>
+                  </pic:spPr>
+                </pic:pic>
+              </a:graphicData>
+            </a:graphic>
+          </wp:inline>
+        </w:drawing>
+      </w:r>
+    </w:p>
+    <w:p>
+      <w:pPr>
+        <w:rPr>
+          <w:b/>
+          <w:sz w:val="36"/>
+          <w:lang w:val="en-US"/>
+        </w:rPr>
+      </w:pPr>
+      <w:r>
+        <w:rPr>
+          <w:b/>
+          <w:sz w:val="36"/>
+          <w:lang w:val="en-US"/>
+        </w:rPr>
+        <w:t>HOL2</w:t>
+      </w:r>
+    </w:p>
+    <w:p>
+      <w:pPr>
+        <w:rPr>
+          <w:b/>
+          <w:sz w:val="36"/>
+          <w:lang w:val="en-US"/>
+        </w:rPr>
+      </w:pPr>
+      <w:r>
+        <w:rPr>
+          <w:b/>
+          <w:sz w:val="36"/>
+          <w:lang w:val="en-US"/>
+        </w:rPr>
+        <w:drawing>
+          <wp:inline distT="0" distB="0" distL="0" distR="0" wp14:anchorId="3060FDB7" wp14:editId="468D8302">
+            <wp:extent cx="5095540" cy="2705100"/>
+            <wp:effectExtent l="0" t="0" r="0" b="0"/>
+            <wp:docPr id="16" name="Picture 16"/>
+            <wp:cNvGraphicFramePr>
+              <a:graphicFrameLocks xmlns:a="http://schemas.openxmlformats.org/drawingml/2006/main" noChangeAspect="1"/>
+            </wp:cNvGraphicFramePr>
+            <a:graphic xmlns:a="http://schemas.openxmlformats.org/drawingml/2006/main">
+              <a:graphicData uri="http://schemas.openxmlformats.org/drawingml/2006/picture">
+                <pic:pic xmlns:pic="http://schemas.openxmlformats.org/drawingml/2006/picture">
+                  <pic:nvPicPr>
+                    <pic:cNvPr id="0" name=""/>
+                    <pic:cNvPicPr/>
+                  </pic:nvPicPr>
+                  <pic:blipFill>
+                    <a:blip r:embed="rId20"/>
+                    <a:stretch>
+                      <a:fillRect/>
+                    </a:stretch>
+                  </pic:blipFill>
+                  <pic:spPr>
+                    <a:xfrm>
+                      <a:off x="0" y="0"/>
+                      <a:ext cx="5099463" cy="2707183"/>
+                    </a:xfrm>
+                    <a:prstGeom prst="rect">
+                      <a:avLst/>
+                    </a:prstGeom>
+                  </pic:spPr>
+                </pic:pic>
+              </a:graphicData>
+            </a:graphic>
+          </wp:inline>
+        </w:drawing>
+      </w:r>
+    </w:p>
+    <w:p>
+      <w:pPr>
+        <w:rPr>
+          <w:b/>
+          <w:sz w:val="36"/>
+          <w:lang w:val="en-US"/>
+        </w:rPr>
+      </w:pPr>
+      <w:r>
+        <w:rPr>
+          <w:b/>
+          <w:sz w:val="36"/>
+          <w:lang w:val="en-US"/>
+        </w:rPr>
+        <w:drawing>
+          <wp:inline distT="0" distB="0" distL="0" distR="0" wp14:anchorId="1792A8FB" wp14:editId="38A2AB18">
+            <wp:extent cx="4953000" cy="2601913"/>
+            <wp:effectExtent l="0" t="0" r="0" b="8255"/>
+            <wp:docPr id="17" name="Picture 17"/>
+            <wp:cNvGraphicFramePr>
+              <a:graphicFrameLocks xmlns:a="http://schemas.openxmlformats.org/drawingml/2006/main" noChangeAspect="1"/>
+            </wp:cNvGraphicFramePr>
+            <a:graphic xmlns:a="http://schemas.openxmlformats.org/drawingml/2006/main">
+              <a:graphicData uri="http://schemas.openxmlformats.org/drawingml/2006/picture">
+                <pic:pic xmlns:pic="http://schemas.openxmlformats.org/drawingml/2006/picture">
+                  <pic:nvPicPr>
+                    <pic:cNvPr id="0" name=""/>
+                    <pic:cNvPicPr/>
+                  </pic:nvPicPr>
+                  <pic:blipFill>
+                    <a:blip r:embed="rId21"/>
+                    <a:stretch>
+                      <a:fillRect/>
+                    </a:stretch>
+                  </pic:blipFill>
+                  <pic:spPr>
+                    <a:xfrm>
+                      <a:off x="0" y="0"/>
+                      <a:ext cx="4954613" cy="2602760"/>
+                    </a:xfrm>
+                    <a:prstGeom prst="rect">
+                      <a:avLst/>
+                    </a:prstGeom>
+                  </pic:spPr>
+                </pic:pic>
+              </a:graphicData>
+            </a:graphic>
+          </wp:inline>
+        </w:drawing>
+      </w:r>
+    </w:p>
+    <w:p>
+      <w:pPr>
+        <w:rPr>
+          <w:b/>
+          <w:sz w:val="36"/>
+          <w:lang w:val="en-US"/>
+        </w:rPr>
+      </w:pPr>
+      <w:r>
+        <w:rPr>
+          <w:b/>
+          <w:sz w:val="36"/>
+          <w:lang w:val="en-US"/>
+        </w:rPr>
+        <w:lastRenderedPageBreak/>
+        <w:t>HOL3</w:t>
+      </w:r>
+    </w:p>
+    <w:p>
+      <w:pPr>
+        <w:rPr>
+          <w:b/>
+          <w:sz w:val="36"/>
+          <w:lang w:val="en-US"/>
+        </w:rPr>
+      </w:pPr>
+      <w:r>
+        <w:rPr>
+          <w:b/>
+          <w:sz w:val="36"/>
+          <w:lang w:val="en-US"/>
+        </w:rPr>
+        <w:drawing>
+          <wp:inline distT="0" distB="0" distL="0" distR="0" wp14:anchorId="46421281" wp14:editId="37EBDCC9">
+            <wp:extent cx="4696474" cy="2491740"/>
+            <wp:effectExtent l="0" t="0" r="8890" b="3810"/>
+            <wp:docPr id="18" name="Picture 18"/>
+            <wp:cNvGraphicFramePr>
+              <a:graphicFrameLocks xmlns:a="http://schemas.openxmlformats.org/drawingml/2006/main" noChangeAspect="1"/>
+            </wp:cNvGraphicFramePr>
+            <a:graphic xmlns:a="http://schemas.openxmlformats.org/drawingml/2006/main">
+              <a:graphicData uri="http://schemas.openxmlformats.org/drawingml/2006/picture">
+                <pic:pic xmlns:pic="http://schemas.openxmlformats.org/drawingml/2006/picture">
+                  <pic:nvPicPr>
+                    <pic:cNvPr id="0" name=""/>
+                    <pic:cNvPicPr/>
+                  </pic:nvPicPr>
+                  <pic:blipFill>
+                    <a:blip r:embed="rId22"/>
+                    <a:stretch>
+                      <a:fillRect/>
+                    </a:stretch>
+                  </pic:blipFill>
+                  <pic:spPr>
+                    <a:xfrm>
+                      <a:off x="0" y="0"/>
+                      <a:ext cx="4697253" cy="2492153"/>
+                    </a:xfrm>
+                    <a:prstGeom prst="rect">
+                      <a:avLst/>
+                    </a:prstGeom>
+                  </pic:spPr>
+                </pic:pic>
+              </a:graphicData>
+            </a:graphic>
+          </wp:inline>
+        </w:drawing>
+      </w:r>
+    </w:p>
+    <w:p>
+      <w:pPr>
+        <w:rPr>
+          <w:b/>
+          <w:sz w:val="36"/>
+          <w:lang w:val="en-US"/>
+        </w:rPr>
+      </w:pPr>
+      <w:r>
+        <w:rPr>
+          <w:b/>
+          <w:sz w:val="36"/>
+          <w:lang w:val="en-US"/>
+        </w:rPr>
+        <w:drawing>
+          <wp:inline distT="0" distB="0" distL="0" distR="0" wp14:anchorId="2BB8A607" wp14:editId="2474125C">
+            <wp:extent cx="5280430" cy="2689860"/>
+            <wp:effectExtent l="0" t="0" r="0" b="0"/>
+            <wp:docPr id="19" name="Picture 19"/>
+            <wp:cNvGraphicFramePr>
+              <a:graphicFrameLocks xmlns:a="http://schemas.openxmlformats.org/drawingml/2006/main" noChangeAspect="1"/>
+            </wp:cNvGraphicFramePr>
+            <a:graphic xmlns:a="http://schemas.openxmlformats.org/drawingml/2006/main">
+              <a:graphicData uri="http://schemas.openxmlformats.org/drawingml/2006/picture">
+                <pic:pic xmlns:pic="http://schemas.openxmlformats.org/drawingml/2006/picture">
+                  <pic:nvPicPr>
+                    <pic:cNvPr id="0" name=""/>
+                    <pic:cNvPicPr/>
+                  </pic:nvPicPr>
+                  <pic:blipFill>
+                    <a:blip r:embed="rId23"/>
+                    <a:stretch>
+                      <a:fillRect/>
+                    </a:stretch>
+                  </pic:blipFill>
+                  <pic:spPr>
+                    <a:xfrm>
+                      <a:off x="0" y="0"/>
+                      <a:ext cx="5282567" cy="2690948"/>
+                    </a:xfrm>
+                    <a:prstGeom prst="rect">
+                      <a:avLst/>
+                    </a:prstGeom>
+                  </pic:spPr>
+                </pic:pic>
+              </a:graphicData>
+            </a:graphic>
+          </wp:inline>
+        </w:drawing>
+      </w:r>
+    </w:p>
+    <w:p>
+      <w:pPr>
+        <w:rPr>
+          <w:b/>
+          <w:sz w:val="36"/>
+          <w:lang w:val="en-US"/>
+        </w:rPr>
+      </w:pPr>
+      <w:r>
+        <w:rPr>
+          <w:b/>
+          <w:sz w:val="36"/>
+          <w:lang w:val="en-US"/>
+        </w:rPr>
+        <w:drawing>
+          <wp:inline distT="0" distB="0" distL="0" distR="0" wp14:anchorId="797FDD80" wp14:editId="5BA18051">
+            <wp:extent cx="5318760" cy="2821897"/>
+            <wp:effectExtent l="0" t="0" r="0" b="0"/>
+            <wp:docPr id="20" name="Picture 20"/>
+            <wp:cNvGraphicFramePr>
+              <a:graphicFrameLocks xmlns:a="http://schemas.openxmlformats.org/drawingml/2006/main" noChangeAspect="1"/>
+            </wp:cNvGraphicFramePr>
+            <a:graphic xmlns:a="http://schemas.openxmlformats.org/drawingml/2006/main">
+              <a:graphicData uri="http://schemas.openxmlformats.org/drawingml/2006/picture">
+                <pic:pic xmlns:pic="http://schemas.openxmlformats.org/drawingml/2006/picture">
+                  <pic:nvPicPr>
+                    <pic:cNvPr id="0" name=""/>
+                    <pic:cNvPicPr/>
+                  </pic:nvPicPr>
+                  <pic:blipFill>
+                    <a:blip r:embed="rId24"/>
+                    <a:stretch>
+                      <a:fillRect/>
+                    </a:stretch>
+                  </pic:blipFill>
+                  <pic:spPr>
+                    <a:xfrm>
+                      <a:off x="0" y="0"/>
+                      <a:ext cx="5320517" cy="2822829"/>
+                    </a:xfrm>
+                    <a:prstGeom prst="rect">
+                      <a:avLst/>
+                    </a:prstGeom>
+                  </pic:spPr>
+                </pic:pic>
+              </a:graphicData>
+            </a:graphic>
+          </wp:inline>
+        </w:drawing>
+      </w:r>
+    </w:p>
+    <w:p>
+      <w:pPr>
+        <w:rPr>
+          <w:b/>
+          <w:sz w:val="36"/>
+          <w:lang w:val="en-US"/>
+        </w:rPr>
+      </w:pPr>
+      <w:r>
+        <w:rPr>
+          <w:b/>
+          <w:sz w:val="36"/>
+          <w:lang w:val="en-US"/>
+        </w:rPr>
+        <w:lastRenderedPageBreak/>
+        <w:t>HOL4</w:t>
+      </w:r>
+    </w:p>
+    <w:p>
+      <w:pPr>
+        <w:rPr>
+          <w:b/>
+          <w:sz w:val="36"/>
+          <w:lang w:val="en-US"/>
+        </w:rPr>
+      </w:pPr>
+      <w:r>
+        <w:rPr>
+          <w:b/>
+          <w:sz w:val="36"/>
+          <w:lang w:val="en-US"/>
+        </w:rPr>
+        <w:drawing>
+          <wp:inline distT="0" distB="0" distL="0" distR="0" wp14:anchorId="148F65B9" wp14:editId="196E92EF">
+            <wp:extent cx="4708939" cy="2499360"/>
+            <wp:effectExtent l="0" t="0" r="0" b="0"/>
+            <wp:docPr id="21" name="Picture 21"/>
+            <wp:cNvGraphicFramePr>
+              <a:graphicFrameLocks xmlns:a="http://schemas.openxmlformats.org/drawingml/2006/main" noChangeAspect="1"/>
+            </wp:cNvGraphicFramePr>
+            <a:graphic xmlns:a="http://schemas.openxmlformats.org/drawingml/2006/main">
+              <a:graphicData uri="http://schemas.openxmlformats.org/drawingml/2006/picture">
+                <pic:pic xmlns:pic="http://schemas.openxmlformats.org/drawingml/2006/picture">
+                  <pic:nvPicPr>
+                    <pic:cNvPr id="0" name=""/>
+                    <pic:cNvPicPr/>
+                  </pic:nvPicPr>
+                  <pic:blipFill>
+                    <a:blip r:embed="rId25"/>
+                    <a:stretch>
+                      <a:fillRect/>
+                    </a:stretch>
+                  </pic:blipFill>
+                  <pic:spPr>
+                    <a:xfrm>
+                      <a:off x="0" y="0"/>
+                      <a:ext cx="4711617" cy="2500781"/>
+                    </a:xfrm>
+                    <a:prstGeom prst="rect">
+                      <a:avLst/>
+                    </a:prstGeom>
+                  </pic:spPr>
+                </pic:pic>
+              </a:graphicData>
+            </a:graphic>
+          </wp:inline>
+        </w:drawing>
+      </w:r>
+    </w:p>
+    <w:p>
+      <w:pPr>
+        <w:rPr>
+          <w:b/>
+          <w:sz w:val="36"/>
+          <w:lang w:val="en-US"/>
+        </w:rPr>
+      </w:pPr>
+      <w:r>
+        <w:rPr>
+          <w:b/>
+          <w:sz w:val="36"/>
+          <w:lang w:val="en-US"/>
+        </w:rPr>
+        <w:drawing>
+          <wp:inline distT="0" distB="0" distL="0" distR="0" wp14:anchorId="23709D69" wp14:editId="4AD0B4B2">
+            <wp:extent cx="3418625" cy="2606040"/>
+            <wp:effectExtent l="0" t="0" r="0" b="3810"/>
+            <wp:docPr id="22" name="Picture 22"/>
+            <wp:cNvGraphicFramePr>
+              <a:graphicFrameLocks xmlns:a="http://schemas.openxmlformats.org/drawingml/2006/main" noChangeAspect="1"/>
+            </wp:cNvGraphicFramePr>
+            <a:graphic xmlns:a="http://schemas.openxmlformats.org/drawingml/2006/main">
+              <a:graphicData uri="http://schemas.openxmlformats.org/drawingml/2006/picture">
+                <pic:pic xmlns:pic="http://schemas.openxmlformats.org/drawingml/2006/picture">
+                  <pic:nvPicPr>
+                    <pic:cNvPr id="0" name=""/>
+                    <pic:cNvPicPr/>
+                  </pic:nvPicPr>
+                  <pic:blipFill>
+                    <a:blip r:embed="rId26"/>
+                    <a:stretch>
+                      <a:fillRect/>
+                    </a:stretch>
+                  </pic:blipFill>
+                  <pic:spPr>
+                    <a:xfrm>
+                      <a:off x="0" y="0"/>
+                      <a:ext cx="3418921" cy="2606266"/>
+                    </a:xfrm>
+                    <a:prstGeom prst="rect">
+                      <a:avLst/>
+                    </a:prstGeom>
+                  </pic:spPr>
+                </pic:pic>
+              </a:graphicData>
+            </a:graphic>
+          </wp:inline>
+        </w:drawing>
+      </w:r>
+    </w:p>
+    <w:p>
+      <w:pPr>
+        <w:rPr>
+          <w:b/>
+          <w:sz w:val="36"/>
+          <w:lang w:val="en-US"/>
+        </w:rPr>
+      </w:pPr>
+      <w:r>
+        <w:rPr>
+          <w:b/>
+          <w:sz w:val="36"/>
+          <w:lang w:val="en-US"/>
+        </w:rPr>
+        <w:drawing>
+          <wp:inline distT="0" distB="0" distL="0" distR="0" wp14:anchorId="337E2B25" wp14:editId="334E6E95">
+            <wp:extent cx="5177964" cy="2735580"/>
+            <wp:effectExtent l="0" t="0" r="3810" b="7620"/>
+            <wp:docPr id="23" name="Picture 23"/>
+            <wp:cNvGraphicFramePr>
+              <a:graphicFrameLocks xmlns:a="http://schemas.openxmlformats.org/drawingml/2006/main" noChangeAspect="1"/>
+            </wp:cNvGraphicFramePr>
+            <a:graphic xmlns:a="http://schemas.openxmlformats.org/drawingml/2006/main">
+              <a:graphicData uri="http://schemas.openxmlformats.org/drawingml/2006/picture">
+                <pic:pic xmlns:pic="http://schemas.openxmlformats.org/drawingml/2006/picture">
+                  <pic:nvPicPr>
+                    <pic:cNvPr id="0" name=""/>
+                    <pic:cNvPicPr/>
+                  </pic:nvPicPr>
+                  <pic:blipFill>
+                    <a:blip r:embed="rId27"/>
+                    <a:stretch>
+                      <a:fillRect/>
+                    </a:stretch>
+                  </pic:blipFill>
+                  <pic:spPr>
+                    <a:xfrm>
+                      <a:off x="0" y="0"/>
+                      <a:ext cx="5172234" cy="2732553"/>
+                    </a:xfrm>
+                    <a:prstGeom prst="rect">
+                      <a:avLst/>
+                    </a:prstGeom>
+                  </pic:spPr>
+                </pic:pic>
+              </a:graphicData>
+            </a:graphic>
+          </wp:inline>
+        </w:drawing>
+      </w:r>
+    </w:p>
+    <w:p>
+      <w:pPr>
+        <w:rPr>
+          <w:b/>
+          <w:sz w:val="36"/>
+          <w:lang w:val="en-US"/>
+        </w:rPr>
+      </w:pPr>
+      <w:r>
+        <w:rPr>
+          <w:b/>
+          <w:sz w:val="36"/>
+          <w:lang w:val="en-US"/>
+        </w:rPr>
+        <w:lastRenderedPageBreak/>
+        <w:drawing>
+          <wp:inline distT="0" distB="0" distL="0" distR="0" wp14:anchorId="7260BEE9" wp14:editId="1067D661">
+            <wp:extent cx="5085795" cy="2857500"/>
+            <wp:effectExtent l="0" t="0" r="635" b="0"/>
+            <wp:docPr id="24" name="Picture 24"/>
+            <wp:cNvGraphicFramePr>
+              <a:graphicFrameLocks xmlns:a="http://schemas.openxmlformats.org/drawingml/2006/main" noChangeAspect="1"/>
+            </wp:cNvGraphicFramePr>
+            <a:graphic xmlns:a="http://schemas.openxmlformats.org/drawingml/2006/main">
+              <a:graphicData uri="http://schemas.openxmlformats.org/drawingml/2006/picture">
+                <pic:pic xmlns:pic="http://schemas.openxmlformats.org/drawingml/2006/picture">
+                  <pic:nvPicPr>
+                    <pic:cNvPr id="0" name=""/>
+                    <pic:cNvPicPr/>
+                  </pic:nvPicPr>
+                  <pic:blipFill>
+                    <a:blip r:embed="rId28"/>
+                    <a:stretch>
+                      <a:fillRect/>
+                    </a:stretch>
+                  </pic:blipFill>
+                  <pic:spPr>
+                    <a:xfrm>
+                      <a:off x="0" y="0"/>
+                      <a:ext cx="5081419" cy="2855041"/>
+                    </a:xfrm>
+                    <a:prstGeom prst="rect">
+                      <a:avLst/>
+                    </a:prstGeom>
+                  </pic:spPr>
+                </pic:pic>
+              </a:graphicData>
+            </a:graphic>
+          </wp:inline>
+        </w:drawing>
+      </w:r>
+    </w:p>
+    <w:p>
+      <w:pPr>
+        <w:rPr>
+          <w:b/>
+          <w:sz w:val="36"/>
+          <w:lang w:val="en-US"/>
+        </w:rPr>
+      </w:pPr>
+      <w:r>
+        <w:rPr>
+          <w:b/>
+          <w:sz w:val="36"/>
+          <w:lang w:val="en-US"/>
+        </w:rPr>
+        <w:drawing>
+          <wp:inline distT="0" distB="0" distL="0" distR="0" wp14:anchorId="1F5E6809" wp14:editId="54AB4AB6">
+            <wp:extent cx="5016616" cy="2628900"/>
+            <wp:effectExtent l="0" t="0" r="0" b="0"/>
+            <wp:docPr id="25" name="Picture 25"/>
+            <wp:cNvGraphicFramePr>
+              <a:graphicFrameLocks xmlns:a="http://schemas.openxmlformats.org/drawingml/2006/main" noChangeAspect="1"/>
+            </wp:cNvGraphicFramePr>
+            <a:graphic xmlns:a="http://schemas.openxmlformats.org/drawingml/2006/main">
+              <a:graphicData uri="http://schemas.openxmlformats.org/drawingml/2006/picture">
+                <pic:pic xmlns:pic="http://schemas.openxmlformats.org/drawingml/2006/picture">
+                  <pic:nvPicPr>
+                    <pic:cNvPr id="0" name=""/>
+                    <pic:cNvPicPr/>
+                  </pic:nvPicPr>
+                  <pic:blipFill>
+                    <a:blip r:embed="rId29"/>
+                    <a:stretch>
+                      <a:fillRect/>
+                    </a:stretch>
+                  </pic:blipFill>
+                  <pic:spPr>
+                    <a:xfrm>
+                      <a:off x="0" y="0"/>
+                      <a:ext cx="5018708" cy="2629996"/>
+                    </a:xfrm>
+                    <a:prstGeom prst="rect">
+                      <a:avLst/>
+                    </a:prstGeom>
+                  </pic:spPr>
+                </pic:pic>
+              </a:graphicData>
+            </a:graphic>
+          </wp:inline>
+        </w:drawing>
+      </w:r>
+    </w:p>
+    <w:p>
+      <w:pPr>
+        <w:rPr>
+          <w:b/>
+          <w:sz w:val="36"/>
+          <w:lang w:val="en-US"/>
+        </w:rPr>
+      </w:pPr>
+      <w:r>
+        <w:rPr>
+          <w:b/>
+          <w:sz w:val="36"/>
+          <w:lang w:val="en-US"/>
+        </w:rPr>
+        <w:t>HOL5</w:t>
+      </w:r>
+    </w:p>
+    <w:p>
+      <w:pPr>
+        <w:rPr>
+          <w:b/>
+          <w:sz w:val="36"/>
+          <w:lang w:val="en-US"/>
+        </w:rPr>
+      </w:pPr>
+      <w:r>
+        <w:rPr>
+          <w:b/>
+          <w:sz w:val="36"/>
+          <w:lang w:val="en-US"/>
+        </w:rPr>
+        <w:drawing>
+          <wp:inline distT="0" distB="0" distL="0" distR="0" wp14:anchorId="0C85E897" wp14:editId="00A3E59B">
+            <wp:extent cx="4874393" cy="2506980"/>
+            <wp:effectExtent l="0" t="0" r="2540" b="7620"/>
+            <wp:docPr id="26" name="Picture 26"/>
+            <wp:cNvGraphicFramePr>
+              <a:graphicFrameLocks xmlns:a="http://schemas.openxmlformats.org/drawingml/2006/main" noChangeAspect="1"/>
+            </wp:cNvGraphicFramePr>
+            <a:graphic xmlns:a="http://schemas.openxmlformats.org/drawingml/2006/main">
+              <a:graphicData uri="http://schemas.openxmlformats.org/drawingml/2006/picture">
+                <pic:pic xmlns:pic="http://schemas.openxmlformats.org/drawingml/2006/picture">
+                  <pic:nvPicPr>
+                    <pic:cNvPr id="0" name=""/>
+                    <pic:cNvPicPr/>
+                  </pic:nvPicPr>
+                  <pic:blipFill>
+                    <a:blip r:embed="rId30"/>
+                    <a:stretch>
+                      <a:fillRect/>
+                    </a:stretch>
+                  </pic:blipFill>
+                  <pic:spPr>
+                    <a:xfrm>
+                      <a:off x="0" y="0"/>
+                      <a:ext cx="4872524" cy="2506019"/>
+                    </a:xfrm>
+                    <a:prstGeom prst="rect">
+                      <a:avLst/>
+                    </a:prstGeom>
+                  </pic:spPr>
+                </pic:pic>
+              </a:graphicData>
+            </a:graphic>
+          </wp:inline>
+        </w:drawing>
+      </w:r>
       <w:bookmarkStart w:id="0" w:name="_GoBack"/>
       <w:bookmarkEnd w:id="0"/>
+    </w:p>
+    <w:p>
+      <w:pPr>
+        <w:rPr>
+          <w:b/>
+          <w:sz w:val="36"/>
+          <w:lang w:val="en-US"/>
+        </w:rPr>
+      </w:pPr>
+    </w:p>
+    <w:p>
+      <w:pPr>
+        <w:rPr>
+          <w:b/>
+          <w:sz w:val="36"/>
+          <w:lang w:val="en-US"/>
+        </w:rPr>
+      </w:pPr>
+    </w:p>
+    <w:p>
+      <w:pPr>
+        <w:rPr>
+          <w:b/>
+          <w:sz w:val="36"/>
+          <w:lang w:val="en-US"/>
+        </w:rPr>
+      </w:pPr>
+    </w:p>
+    <w:p>
+      <w:pPr>
+        <w:rPr>
+          <w:b/>
+          <w:sz w:val="36"/>
+          <w:lang w:val="en-US"/>
+        </w:rPr>
+      </w:pPr>
+    </w:p>
+    <w:p>
+      <w:pPr>
+        <w:rPr>
+          <w:b/>
+          <w:sz w:val="36"/>
+          <w:lang w:val="en-US"/>
+        </w:rPr>
+      </w:pPr>
     </w:p>
     <w:sectPr>
       <w:pgSz w:w="11906" w:h="16838"/>

</xml_diff>